<commit_message>
Deal memo polish: clean fills, blanks, n/a, no sign-here marks
Driven by the received PDF's rough edges:
- Marker highlights stripped and covers sized to the text line with the
  brace descender included — no visible white patches or yellow
  remnants anywhere.
- Values draw at the template's 9pt on its baseline as full natural
  phrases (£232 per day), via unit suffixes captured in the coordinate
  map.
- Crew-fill fields are clean empty space (no underscore runs), with a
  writable gap restored in the nationality sentence; signature rules
  kept.
- Untracked allowances and per diems read n/a; car/box render £X per
  week or n/a as full phrases in both the Word and PDF outputs.
- SIGN HERE marginalia and the yellow sign-here arrow shape removed
  from both templates.
Templates rebuilt deterministically from the pristine originals and
XSD-validated; all three memo pages visually verified at zoom.

Co-Authored-By: Claude Fable 5 <noreply@anthropic.com>
</commit_message>
<xml_diff>
--- a/public/deal-memo/direct-hire.docx
+++ b/public/deal-memo/direct-hire.docx
@@ -1049,7 +1049,7 @@
                 <w:szCs w:val="18"/>
                 <w:lang w:val="en-GB" w:eastAsia="en-GB"/>
               </w:rPr>
-              <w:t xml:space="preserve">____________________</w:t>
+              <w:t xml:space="preserve"/>
             </w:r>
           </w:p>
           <w:p>
@@ -1124,7 +1124,7 @@
                 <w:szCs w:val="18"/>
                 <w:lang w:val="en-GB" w:eastAsia="en-GB"/>
               </w:rPr>
-              <w:t xml:space="preserve">____________________</w:t>
+              <w:t xml:space="preserve"/>
             </w:r>
           </w:p>
           <w:p>
@@ -1348,7 +1348,6 @@
                 <w:rFonts w:asciiTheme="minorBidi" w:eastAsia="Times New Roman" w:hAnsiTheme="minorBidi"/>
                 <w:sz w:val="18"/>
                 <w:szCs w:val="18"/>
-                <w:highlight w:val="yellow"/>
                 <w:lang w:val="en-GB" w:eastAsia="en-GB"/>
               </w:rPr>
               <w:t>{schedule_status}</w:t>
@@ -2566,7 +2565,6 @@
                 <w:rFonts w:asciiTheme="minorBidi" w:eastAsia="Times New Roman" w:hAnsiTheme="minorBidi"/>
                 <w:sz w:val="18"/>
                 <w:szCs w:val="18"/>
-                <w:highlight w:val="yellow"/>
                 <w:lang w:val="en-GB" w:eastAsia="en-GB"/>
               </w:rPr>
               <w:t xml:space="preserve"/>
@@ -2796,7 +2794,6 @@
                 <w:rFonts w:asciiTheme="minorBidi" w:eastAsia="Times New Roman" w:hAnsiTheme="minorBidi"/>
                 <w:sz w:val="18"/>
                 <w:szCs w:val="18"/>
-                <w:highlight w:val="yellow"/>
                 <w:lang w:val="en-GB" w:eastAsia="en-GB"/>
               </w:rPr>
               <w:t xml:space="preserve"/>
@@ -3012,7 +3009,6 @@
                 <w:rFonts w:asciiTheme="minorBidi" w:eastAsia="Times New Roman" w:hAnsiTheme="minorBidi"/>
                 <w:sz w:val="18"/>
                 <w:szCs w:val="18"/>
-                <w:highlight w:val="yellow"/>
                 <w:lang w:val="en-GB" w:eastAsia="en-GB"/>
               </w:rPr>
               <w:t xml:space="preserve"/>
@@ -3295,7 +3291,6 @@
                 <w:rFonts w:asciiTheme="minorBidi" w:eastAsia="Times New Roman" w:hAnsiTheme="minorBidi"/>
                 <w:sz w:val="18"/>
                 <w:szCs w:val="18"/>
-                <w:highlight w:val="yellow"/>
                 <w:lang w:val="en-GB" w:eastAsia="en-GB"/>
               </w:rPr>
               <w:t xml:space="preserve"/>
@@ -3555,7 +3550,6 @@
                 <w:rFonts w:asciiTheme="minorBidi" w:eastAsia="Times New Roman" w:hAnsiTheme="minorBidi"/>
                 <w:sz w:val="18"/>
                 <w:szCs w:val="18"/>
-                <w:highlight w:val="yellow"/>
                 <w:lang w:val="en-GB" w:eastAsia="en-GB"/>
               </w:rPr>
               <w:t xml:space="preserve"/>
@@ -3794,7 +3788,6 @@
                 <w:rFonts w:asciiTheme="minorBidi" w:eastAsia="Times New Roman" w:hAnsiTheme="minorBidi"/>
                 <w:sz w:val="18"/>
                 <w:szCs w:val="18"/>
-                <w:highlight w:val="yellow"/>
                 <w:lang w:val="en-GB" w:eastAsia="en-GB"/>
               </w:rPr>
               <w:t xml:space="preserve"/>
@@ -4537,7 +4530,7 @@
                 <w:szCs w:val="18"/>
                 <w:lang w:val="en-GB" w:eastAsia="en-GB"/>
               </w:rPr>
-              <w:t>£</w:t>
+              <w:t>{car_allowance}</w:t>
             </w:r>
             <w:r>
               <w:rPr>
@@ -4546,7 +4539,7 @@
                 <w:szCs w:val="18"/>
                 <w:lang w:val="en-GB" w:eastAsia="en-GB"/>
               </w:rPr>
-              <w:t xml:space="preserve">{car_allowance} per week/day</w:t>
+              <w:t xml:space="preserve"/>
             </w:r>
           </w:p>
           <w:p>
@@ -4690,7 +4683,7 @@
                 <w:szCs w:val="18"/>
                 <w:lang w:val="en-GB" w:eastAsia="en-GB"/>
               </w:rPr>
-              <w:t>£</w:t>
+              <w:t>n/a</w:t>
             </w:r>
             <w:r>
               <w:rPr>
@@ -4699,7 +4692,7 @@
                 <w:szCs w:val="18"/>
                 <w:lang w:val="en-GB" w:eastAsia="en-GB"/>
               </w:rPr>
-              <w:t xml:space="preserve">__________ per week/day</w:t>
+              <w:t xml:space="preserve"/>
             </w:r>
           </w:p>
           <w:p>
@@ -4843,7 +4836,7 @@
                 <w:szCs w:val="18"/>
                 <w:lang w:val="en-GB" w:eastAsia="en-GB"/>
               </w:rPr>
-              <w:t>£</w:t>
+              <w:t>{box_rental}</w:t>
             </w:r>
             <w:r>
               <w:rPr>
@@ -4852,7 +4845,7 @@
                 <w:szCs w:val="18"/>
                 <w:lang w:val="en-GB" w:eastAsia="en-GB"/>
               </w:rPr>
-              <w:t xml:space="preserve">{box_rental} per week/day</w:t>
+              <w:t xml:space="preserve"/>
             </w:r>
           </w:p>
           <w:p>
@@ -4996,7 +4989,7 @@
                 <w:szCs w:val="18"/>
                 <w:lang w:val="en-GB" w:eastAsia="en-GB"/>
               </w:rPr>
-              <w:t>£</w:t>
+              <w:t>n/a</w:t>
             </w:r>
             <w:r>
               <w:rPr>
@@ -5005,7 +4998,7 @@
                 <w:szCs w:val="18"/>
                 <w:lang w:val="en-GB" w:eastAsia="en-GB"/>
               </w:rPr>
-              <w:t xml:space="preserve">__________ per week/day</w:t>
+              <w:t xml:space="preserve"/>
             </w:r>
           </w:p>
           <w:p>
@@ -5147,7 +5140,7 @@
                 <w:szCs w:val="18"/>
                 <w:lang w:val="en-GB" w:eastAsia="en-GB"/>
               </w:rPr>
-              <w:t>£</w:t>
+              <w:t>n/a</w:t>
             </w:r>
             <w:r>
               <w:rPr>
@@ -5156,7 +5149,7 @@
                 <w:szCs w:val="18"/>
                 <w:lang w:val="en-GB" w:eastAsia="en-GB"/>
               </w:rPr>
-              <w:t xml:space="preserve">__________ per week/day</w:t>
+              <w:t xml:space="preserve"/>
             </w:r>
           </w:p>
           <w:p>
@@ -5308,7 +5301,7 @@
                 <w:szCs w:val="18"/>
                 <w:lang w:val="en-GB" w:eastAsia="en-GB"/>
               </w:rPr>
-              <w:t>£</w:t>
+              <w:t>n/a</w:t>
             </w:r>
             <w:r>
               <w:rPr>
@@ -5317,7 +5310,7 @@
                 <w:szCs w:val="18"/>
                 <w:lang w:val="en-GB" w:eastAsia="en-GB"/>
               </w:rPr>
-              <w:t xml:space="preserve">__________ per week/day</w:t>
+              <w:t xml:space="preserve"/>
             </w:r>
           </w:p>
           <w:p>
@@ -5461,7 +5454,7 @@
                 <w:szCs w:val="18"/>
                 <w:lang w:val="en-GB" w:eastAsia="en-GB"/>
               </w:rPr>
-              <w:t>£</w:t>
+              <w:t>n/a</w:t>
             </w:r>
             <w:r>
               <w:rPr>
@@ -5470,7 +5463,7 @@
                 <w:szCs w:val="18"/>
                 <w:lang w:val="en-GB" w:eastAsia="en-GB"/>
               </w:rPr>
-              <w:t xml:space="preserve">__________ per week/day</w:t>
+              <w:t xml:space="preserve"/>
             </w:r>
           </w:p>
           <w:p>
@@ -5639,7 +5632,7 @@
                 <w:szCs w:val="18"/>
                 <w:lang w:val="en-GB" w:eastAsia="en-GB"/>
               </w:rPr>
-              <w:t>£</w:t>
+              <w:t>n/a</w:t>
             </w:r>
             <w:r>
               <w:rPr>
@@ -5648,7 +5641,7 @@
                 <w:szCs w:val="18"/>
                 <w:lang w:val="en-GB" w:eastAsia="en-GB"/>
               </w:rPr>
-              <w:t xml:space="preserve">__________ </w:t>
+              <w:t xml:space="preserve"> </w:t>
             </w:r>
             <w:r>
               <w:rPr>
@@ -5667,7 +5660,7 @@
                 <w:szCs w:val="18"/>
                 <w:lang w:val="en-GB" w:eastAsia="en-GB"/>
               </w:rPr>
-              <w:t>£</w:t>
+              <w:t>n/a</w:t>
             </w:r>
             <w:r>
               <w:rPr>
@@ -5676,7 +5669,7 @@
                 <w:szCs w:val="18"/>
                 <w:lang w:val="en-GB" w:eastAsia="en-GB"/>
               </w:rPr>
-              <w:t xml:space="preserve">__________ </w:t>
+              <w:t xml:space="preserve"> </w:t>
             </w:r>
             <w:r>
               <w:rPr>
@@ -6052,14 +6045,13 @@
                 <w:szCs w:val="18"/>
                 <w:lang w:val="en-GB" w:eastAsia="en-GB"/>
               </w:rPr>
-              <w:t>You warrant that you are a ____________________</w:t>
+              <w:t>You warrant that you are a                    national</w:t>
             </w:r>
             <w:r>
               <w:rPr>
                 <w:rFonts w:asciiTheme="minorBidi" w:eastAsia="Times New Roman" w:hAnsiTheme="minorBidi"/>
                 <w:sz w:val="18"/>
                 <w:szCs w:val="18"/>
-                <w:highlight w:val="yellow"/>
                 <w:lang w:val="en-GB" w:eastAsia="en-GB"/>
               </w:rPr>
               <w:t/>
@@ -6071,14 +6063,13 @@
                 <w:szCs w:val="18"/>
                 <w:lang w:val="en-GB" w:eastAsia="en-GB"/>
               </w:rPr>
-              <w:t> national and that you are ordinarily resident in ____________________</w:t>
+              <w:t> and that you are ordinarily resident in                   .</w:t>
             </w:r>
             <w:r>
               <w:rPr>
                 <w:rFonts w:asciiTheme="minorBidi" w:eastAsia="Times New Roman" w:hAnsiTheme="minorBidi"/>
                 <w:sz w:val="18"/>
                 <w:szCs w:val="18"/>
-                <w:highlight w:val="yellow"/>
                 <w:lang w:val="en-GB" w:eastAsia="en-GB"/>
               </w:rPr>
               <w:t/>
@@ -6090,7 +6081,7 @@
                 <w:szCs w:val="18"/>
                 <w:lang w:val="en-GB" w:eastAsia="en-GB"/>
               </w:rPr>
-              <w:t xml:space="preserve">. You further confirm that you have the appropriate right to live and work in the United Kingdom and will provide all necessary documentation (including your passport and, if applicable, any visa or immigration paperwork) as required by Company to comply with the Immigration, Asylum and Nationality Act 2006, the Immigration Act 2014 and the Immigration Act 2016, and any other applicable legislation. Company is under a duty to prevent illegal working and must carry out checks to ensure crew have the appropriate right to live and work in the United Kingdom. Your engagement is conditional upon Company’s receipt of satisfactory evidence of your right to work in the United Kingdom. </w:t>
+              <w:t xml:space="preserve"> You further confirm that you have the appropriate right to live and work in the United Kingdom and will provide all necessary documentation (including your passport and, if applicable, any visa or immigration paperwork) as required by Company to comply with the Immigration, Asylum and Nationality Act 2006, the Immigration Act 2014 and the Immigration Act 2016, and any other applicable legislation. Company is under a duty to prevent illegal working and must carry out checks to ensure crew have the appropriate right to live and work in the United Kingdom. Your engagement is conditional upon Company’s receipt of satisfactory evidence of your right to work in the United Kingdom. </w:t>
             </w:r>
           </w:p>
           <w:p>
@@ -6371,7 +6362,6 @@
                 <w:rFonts w:asciiTheme="minorBidi" w:eastAsia="Times New Roman" w:hAnsiTheme="minorBidi"/>
                 <w:sz w:val="18"/>
                 <w:szCs w:val="18"/>
-                <w:highlight w:val="yellow"/>
                 <w:lang w:val="en-GB" w:eastAsia="en-GB"/>
               </w:rPr>
               <w:t/>
@@ -6411,7 +6401,6 @@
                 <w:rFonts w:asciiTheme="minorBidi" w:eastAsia="Times New Roman" w:hAnsiTheme="minorBidi"/>
                 <w:sz w:val="18"/>
                 <w:szCs w:val="18"/>
-                <w:highlight w:val="yellow"/>
                 <w:lang w:val="en-GB" w:eastAsia="en-GB"/>
               </w:rPr>
               <w:t/>
@@ -6451,14 +6440,13 @@
                 <w:szCs w:val="18"/>
                 <w:lang w:val="en-GB" w:eastAsia="en-GB"/>
               </w:rPr>
-              <w:t xml:space="preserve">Agency: ____________________</w:t>
+              <w:t xml:space="preserve">Agency: </w:t>
             </w:r>
             <w:r>
               <w:rPr>
                 <w:rFonts w:asciiTheme="minorBidi" w:eastAsia="Times New Roman" w:hAnsiTheme="minorBidi"/>
                 <w:sz w:val="18"/>
                 <w:szCs w:val="18"/>
-                <w:highlight w:val="yellow"/>
                 <w:lang w:val="en-GB" w:eastAsia="en-GB"/>
               </w:rPr>
               <w:t/>
@@ -6498,7 +6486,6 @@
                 <w:rFonts w:asciiTheme="minorBidi" w:eastAsia="Times New Roman" w:hAnsiTheme="minorBidi"/>
                 <w:sz w:val="18"/>
                 <w:szCs w:val="18"/>
-                <w:highlight w:val="yellow"/>
                 <w:lang w:val="en-GB" w:eastAsia="en-GB"/>
               </w:rPr>
               <w:t/>
@@ -6952,218 +6939,6 @@
                 <w:sz w:val="18"/>
                 <w:szCs w:val="18"/>
               </w:rPr>
-              <mc:AlternateContent>
-                <mc:Choice Requires="wpg">
-                  <w:drawing>
-                    <wp:anchor distT="0" distB="0" distL="114300" distR="114300" simplePos="0" relativeHeight="251659264" behindDoc="0" locked="0" layoutInCell="1" allowOverlap="1" wp14:anchorId="2AB2FB89" wp14:editId="2F687137">
-                      <wp:simplePos x="0" y="0"/>
-                      <wp:positionH relativeFrom="column">
-                        <wp:posOffset>1995529</wp:posOffset>
-                      </wp:positionH>
-                      <wp:positionV relativeFrom="paragraph">
-                        <wp:posOffset>39945</wp:posOffset>
-                      </wp:positionV>
-                      <wp:extent cx="760730" cy="372110"/>
-                      <wp:effectExtent l="19050" t="19050" r="1270" b="46990"/>
-                      <wp:wrapNone/>
-                      <wp:docPr id="4" name="Group 4"/>
-                      <wp:cNvGraphicFramePr>
-                        <a:graphicFrameLocks xmlns:a="http://schemas.openxmlformats.org/drawingml/2006/main"/>
-                      </wp:cNvGraphicFramePr>
-                      <a:graphic xmlns:a="http://schemas.openxmlformats.org/drawingml/2006/main">
-                        <a:graphicData uri="http://schemas.microsoft.com/office/word/2010/wordprocessingGroup">
-                          <wpg:wgp>
-                            <wpg:cNvGrpSpPr>
-                              <a:grpSpLocks/>
-                            </wpg:cNvGrpSpPr>
-                            <wpg:grpSpPr bwMode="auto">
-                              <a:xfrm>
-                                <a:off x="0" y="0"/>
-                                <a:ext cx="760730" cy="372110"/>
-                                <a:chOff x="7847" y="4137"/>
-                                <a:chExt cx="1198" cy="586"/>
-                              </a:xfrm>
-                            </wpg:grpSpPr>
-                            <wps:wsp>
-                              <wps:cNvPr id="5" name="AutoShape 17"/>
-                              <wps:cNvSpPr>
-                                <a:spLocks noChangeArrowheads="1"/>
-                              </wps:cNvSpPr>
-                              <wps:spPr bwMode="auto">
-                                <a:xfrm rot="10800000">
-                                  <a:off x="7847" y="4137"/>
-                                  <a:ext cx="1021" cy="586"/>
-                                </a:xfrm>
-                                <a:prstGeom prst="stripedRightArrow">
-                                  <a:avLst>
-                                    <a:gd name="adj1" fmla="val 49731"/>
-                                    <a:gd name="adj2" fmla="val 49172"/>
-                                  </a:avLst>
-                                </a:prstGeom>
-                                <a:solidFill>
-                                  <a:srgbClr val="FFFF00"/>
-                                </a:solidFill>
-                                <a:ln w="9525">
-                                  <a:solidFill>
-                                    <a:srgbClr val="BFBFBF"/>
-                                  </a:solidFill>
-                                  <a:miter lim="800000"/>
-                                  <a:headEnd/>
-                                  <a:tailEnd/>
-                                </a:ln>
-                              </wps:spPr>
-                              <wps:bodyPr rot="0" vert="horz" wrap="square" lIns="91440" tIns="45720" rIns="91440" bIns="45720" anchor="t" anchorCtr="0" upright="1">
-                                <a:noAutofit/>
-                              </wps:bodyPr>
-                            </wps:wsp>
-                            <wps:wsp>
-                              <wps:cNvPr id="6" name="Text Box 18"/>
-                              <wps:cNvSpPr txBox="1">
-                                <a:spLocks noChangeArrowheads="1"/>
-                              </wps:cNvSpPr>
-                              <wps:spPr bwMode="auto">
-                                <a:xfrm>
-                                  <a:off x="8112" y="4149"/>
-                                  <a:ext cx="933" cy="574"/>
-                                </a:xfrm>
-                                <a:prstGeom prst="rect">
-                                  <a:avLst/>
-                                </a:prstGeom>
-                                <a:noFill/>
-                                <a:ln>
-                                  <a:noFill/>
-                                </a:ln>
-                              </wps:spPr>
-                              <wps:txbx>
-                                <w:txbxContent>
-                                  <w:p>
-                                    <w:pPr>
-                                      <w:rPr>
-                                        <w:rFonts w:ascii="Verdana" w:hAnsi="Verdana"/>
-                                        <w:b/>
-                                        <w:sz w:val="10"/>
-                                        <w:szCs w:val="10"/>
-                                      </w:rPr>
-                                    </w:pPr>
-                                    <w:r>
-                                      <w:rPr>
-                                        <w:rFonts w:ascii="Verdana" w:hAnsi="Verdana"/>
-                                        <w:b/>
-                                        <w:sz w:val="10"/>
-                                        <w:szCs w:val="10"/>
-                                      </w:rPr>
-                                      <w:t>SIGN</w:t>
-                                    </w:r>
-                                  </w:p>
-                                  <w:p>
-                                    <w:pPr>
-                                      <w:rPr>
-                                        <w:rFonts w:ascii="Verdana" w:hAnsi="Verdana"/>
-                                        <w:b/>
-                                        <w:sz w:val="10"/>
-                                        <w:szCs w:val="10"/>
-                                      </w:rPr>
-                                    </w:pPr>
-                                    <w:r>
-                                      <w:rPr>
-                                        <w:rFonts w:ascii="Verdana" w:hAnsi="Verdana"/>
-                                        <w:b/>
-                                        <w:sz w:val="10"/>
-                                        <w:szCs w:val="10"/>
-                                      </w:rPr>
-                                      <w:t>HERE…</w:t>
-                                    </w:r>
-                                  </w:p>
-                                </w:txbxContent>
-                              </wps:txbx>
-                              <wps:bodyPr rot="0" vert="horz" wrap="square" lIns="91440" tIns="45720" rIns="91440" bIns="45720" anchor="t" anchorCtr="0" upright="1">
-                                <a:noAutofit/>
-                              </wps:bodyPr>
-                            </wps:wsp>
-                          </wpg:wgp>
-                        </a:graphicData>
-                      </a:graphic>
-                      <wp14:sizeRelH relativeFrom="page">
-                        <wp14:pctWidth>0</wp14:pctWidth>
-                      </wp14:sizeRelH>
-                      <wp14:sizeRelV relativeFrom="page">
-                        <wp14:pctHeight>0</wp14:pctHeight>
-                      </wp14:sizeRelV>
-                    </wp:anchor>
-                  </w:drawing>
-                </mc:Choice>
-                <mc:Fallback>
-                  <w:pict>
-                    <v:group w14:anchorId="2AB2FB89" id="Group 4" o:spid="_x0000_s1026" style="position:absolute;margin-left:157.15pt;margin-top:3.15pt;width:59.9pt;height:29.3pt;z-index:251659264" coordorigin="7847,4137" coordsize="1198,586" o:gfxdata="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">
-                      <v:shapetype id="_x0000_t93" coordsize="21600,21600" o:spt="93" adj="16200,5400" path="m@0,l@0@1,3375@1,3375@2@0@2@0,21600,21600,10800xem1350@1l1350@2,2700@2,2700@1xem0@1l0@2,675@2,675@1xe">
-                        <v:stroke joinstyle="miter"/>
-                        <v:formulas>
-                          <v:f eqn="val #0"/>
-                          <v:f eqn="val #1"/>
-                          <v:f eqn="sum height 0 #1"/>
-                          <v:f eqn="sum 10800 0 #1"/>
-                          <v:f eqn="sum width 0 #0"/>
-                          <v:f eqn="prod @4 @3 10800"/>
-                          <v:f eqn="sum width 0 @5"/>
-                        </v:formulas>
-                        <v:path o:connecttype="custom" o:connectlocs="@0,0;0,10800;@0,21600;21600,10800" o:connectangles="270,180,90,0" textboxrect="3375,@1,@6,@2"/>
-                        <v:handles>
-                          <v:h position="#0,#1" xrange="3375,21600" yrange="0,10800"/>
-                        </v:handles>
-                      </v:shapetype>
-                      <v:shape id="AutoShape 17" o:spid="_x0000_s1027" type="#_x0000_t93" style="position:absolute;left:7847;top:4137;width:1021;height:586;rotation:180;visibility:visible;mso-wrap-style:square;v-text-anchor:top" o:gfxdata="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" adj="15504,5429" fillcolor="yellow" strokecolor="#bfbfbf"/>
-                      <v:shapetype id="_x0000_t202" coordsize="21600,21600" o:spt="202" path="m,l,21600r21600,l21600,xe">
-                        <v:stroke joinstyle="miter"/>
-                        <v:path gradientshapeok="t" o:connecttype="rect"/>
-                      </v:shapetype>
-                      <v:shape id="Text Box 18" o:spid="_x0000_s1028" type="#_x0000_t202" style="position:absolute;left:8112;top:4149;width:933;height:574;visibility:visible;mso-wrap-style:square;v-text-anchor:top" o:gfxdata="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" filled="f" stroked="f">
-                        <v:textbox>
-                          <w:txbxContent>
-                            <w:p>
-                              <w:pPr>
-                                <w:rPr>
-                                  <w:rFonts w:ascii="Verdana" w:hAnsi="Verdana"/>
-                                  <w:b/>
-                                  <w:sz w:val="10"/>
-                                  <w:szCs w:val="10"/>
-                                </w:rPr>
-                              </w:pPr>
-                              <w:r>
-                                <w:rPr>
-                                  <w:rFonts w:ascii="Verdana" w:hAnsi="Verdana"/>
-                                  <w:b/>
-                                  <w:sz w:val="10"/>
-                                  <w:szCs w:val="10"/>
-                                </w:rPr>
-                                <w:t>SIGN</w:t>
-                              </w:r>
-                            </w:p>
-                            <w:p>
-                              <w:pPr>
-                                <w:rPr>
-                                  <w:rFonts w:ascii="Verdana" w:hAnsi="Verdana"/>
-                                  <w:b/>
-                                  <w:sz w:val="10"/>
-                                  <w:szCs w:val="10"/>
-                                </w:rPr>
-                              </w:pPr>
-                              <w:r>
-                                <w:rPr>
-                                  <w:rFonts w:ascii="Verdana" w:hAnsi="Verdana"/>
-                                  <w:b/>
-                                  <w:sz w:val="10"/>
-                                  <w:szCs w:val="10"/>
-                                </w:rPr>
-                                <w:t>HERE…</w:t>
-                              </w:r>
-                            </w:p>
-                          </w:txbxContent>
-                        </v:textbox>
-                      </v:shape>
-                    </v:group>
-                  </w:pict>
-                </mc:Fallback>
-              </mc:AlternateContent>
             </w:r>
           </w:p>
           <w:p>

</xml_diff>